<commit_message>
Due dates: emphasize Module 10 is due Friday, April 16
Co-Authored-By: Claude Sonnet 5.5 <noreply@anthropic.com>
Claude-Session: https://claude.ai/code/session_01UqHdqh2796rZQzuF7uxH3N
</commit_message>
<xml_diff>
--- a/downloads/weekly-due-dates-spring-2027.docx
+++ b/downloads/weekly-due-dates-spring-2027.docx
@@ -2459,10 +2459,11 @@
               <w:rPr>
                 <w:b/>
                 <w:bCs/>
-                <w:sz w:val="19"/>
-                <w:szCs w:val="19"/>
-              </w:rPr>
-              <w:t xml:space="preserve">Fri, Apr 16 *</w:t>
+                <w:color w:val="C8102E"/>
+                <w:sz w:val="19"/>
+                <w:szCs w:val="19"/>
+              </w:rPr>
+              <w:t xml:space="preserve">FRIDAY, Apr 16 (not Sunday) *</w:t>
             </w:r>
           </w:p>
         </w:tc>
@@ -2474,10 +2475,13 @@
       </w:pPr>
       <w:r>
         <w:rPr>
-          <w:sz w:val="19"/>
-          <w:szCs w:val="19"/>
+          <w:b/>
+          <w:bCs/>
+          <w:color w:val="C8102E"/>
+          <w:sz w:val="21"/>
+          <w:szCs w:val="21"/>
         </w:rPr>
-        <w:t xml:space="preserve">* Module 10 is due on Friday, April 16, the last day of the course. Sunday, April 18 would fall after the course end date.</w:t>
+        <w:t xml:space="preserve">* NOTE: The Module 10 final project is due on FRIDAY, April 16 at 11:59 pm, not on the usual Sunday. April 16 is the last day of the course.</w:t>
       </w:r>
     </w:p>
     <w:p>

</xml_diff>